<commit_message>
adding wean mass analysis
</commit_message>
<xml_diff>
--- a/TablesFigures/2016_2023_Age_Predictor_Comparison.docx
+++ b/TablesFigures/2016_2023_Age_Predictor_Comparison.docx
@@ -342,7 +342,7 @@
                 <w:szCs w:val="22"/>
                 <w:color w:val="000000"/>
               </w:rPr>
-              <w:t xml:space="preserve">860.2</w:t>
+              <w:t xml:space="preserve">857.4</w:t>
             </w:r>
           </w:p>
         </w:tc>
@@ -446,7 +446,7 @@
                 <w:szCs w:val="22"/>
                 <w:color w:val="000000"/>
               </w:rPr>
-              <w:t xml:space="preserve">0.445</w:t>
+              <w:t xml:space="preserve">0.425</w:t>
             </w:r>
           </w:p>
         </w:tc>
@@ -556,7 +556,7 @@
                 <w:szCs w:val="22"/>
                 <w:color w:val="000000"/>
               </w:rPr>
-              <w:t xml:space="preserve">861.1</w:t>
+              <w:t xml:space="preserve">858.1</w:t>
             </w:r>
           </w:p>
         </w:tc>
@@ -608,7 +608,7 @@
                 <w:szCs w:val="22"/>
                 <w:color w:val="000000"/>
               </w:rPr>
-              <w:t xml:space="preserve">0.84</w:t>
+              <w:t xml:space="preserve">0.69</w:t>
             </w:r>
           </w:p>
         </w:tc>
@@ -660,7 +660,7 @@
                 <w:szCs w:val="22"/>
                 <w:color w:val="000000"/>
               </w:rPr>
-              <w:t xml:space="preserve">0.293</w:t>
+              <w:t xml:space="preserve">0.300</w:t>
             </w:r>
           </w:p>
         </w:tc>
@@ -770,7 +770,7 @@
                 <w:szCs w:val="22"/>
                 <w:color w:val="000000"/>
               </w:rPr>
-              <w:t xml:space="preserve">861.3</w:t>
+              <w:t xml:space="preserve">858.3</w:t>
             </w:r>
           </w:p>
         </w:tc>
@@ -822,7 +822,7 @@
                 <w:szCs w:val="22"/>
                 <w:color w:val="000000"/>
               </w:rPr>
-              <w:t xml:space="preserve">1.07</w:t>
+              <w:t xml:space="preserve">0.87</w:t>
             </w:r>
           </w:p>
         </w:tc>
@@ -874,7 +874,7 @@
                 <w:szCs w:val="22"/>
                 <w:color w:val="000000"/>
               </w:rPr>
-              <w:t xml:space="preserve">0.261</w:t>
+              <w:t xml:space="preserve">0.275</w:t>
             </w:r>
           </w:p>
         </w:tc>

</xml_diff>